<commit_message>
docs(admin-guide): update menu location and CSV import rules
- Admin menu and Cerrar sesión now live under the user-name dropdown
- Document the Pagada column and admin-flag behaviour on CSV reimport
- Regenerate the .docx from the markdown source

Co-Authored-By: Claude Fable 5 <noreply@anthropic.com>
Claude-Session: https://claude.ai/code/session_01JUQRx5H7BNUB1J8KAhSYQv
</commit_message>
<xml_diff>
--- a/docs/guia-administradores.docx
+++ b/docs/guia-administradores.docx
@@ -2,7 +2,7 @@
 <file path=word/document.xml><?xml version="1.0" encoding="utf-8"?>
 <w:document xmlns:w="http://schemas.openxmlformats.org/wordprocessingml/2006/main" xmlns:m="http://schemas.openxmlformats.org/officeDocument/2006/math" xmlns:r="http://schemas.openxmlformats.org/officeDocument/2006/relationships" xmlns:o="urn:schemas-microsoft-com:office:office" xmlns:v="urn:schemas-microsoft-com:vml" xmlns:w10="urn:schemas-microsoft-com:office:word" xmlns:a="http://schemas.openxmlformats.org/drawingml/2006/main" xmlns:pic="http://schemas.openxmlformats.org/drawingml/2006/picture" xmlns:wp="http://schemas.openxmlformats.org/drawingml/2006/wordprocessingDrawing">
   <w:body>
-    <w:bookmarkStart w:id="21" w:name="X4b52c5e35af24295492c0457c899e44cc063876"/>
+    <w:bookmarkStart w:id="22" w:name="X4b52c5e35af24295492c0457c899e44cc063876"/>
     <w:p>
       <w:pPr>
         <w:pStyle w:val="Heading1"/>
@@ -57,23 +57,29 @@
         <w:t xml:space="preserve"> </w:t>
       </w:r>
       <w:r>
-        <w:t xml:space="preserve">pantalla que cualquier socio, en</w:t>
-      </w:r>
-      <w:r>
-        <w:t xml:space="preserve"> </w:t>
-      </w:r>
-      <w:r>
-        <w:rPr>
-          <w:b/>
-          <w:bCs/>
-        </w:rPr>
-        <w:t xml:space="preserve">Ludoteca → Iniciar sesión</w:t>
-      </w:r>
-      <w:r>
-        <w:t xml:space="preserve"> </w:t>
-      </w:r>
-      <w:r>
-        <w:t xml:space="preserve">(</w:t>
+        <w:t xml:space="preserve">pantalla que cualquier socio, con el botón</w:t>
+      </w:r>
+      <w:r>
+        <w:t xml:space="preserve"> </w:t>
+      </w:r>
+      <w:r>
+        <w:rPr>
+          <w:b/>
+          <w:bCs/>
+        </w:rPr>
+        <w:t xml:space="preserve">Iniciar sesión</w:t>
+      </w:r>
+      <w:r>
+        <w:t xml:space="preserve"> </w:t>
+      </w:r>
+      <w:r>
+        <w:t xml:space="preserve">de la</w:t>
+      </w:r>
+      <w:r>
+        <w:t xml:space="preserve"> </w:t>
+      </w:r>
+      <w:r>
+        <w:t xml:space="preserve">cabecera (</w:t>
       </w:r>
       <w:r>
         <w:rPr>
@@ -149,23 +155,13 @@
         <w:pStyle w:val="BodyText"/>
       </w:pPr>
       <w:r>
-        <w:t xml:space="preserve">Cuando entras como administrador, el menú</w:t>
-      </w:r>
-      <w:r>
-        <w:t xml:space="preserve"> </w:t>
-      </w:r>
-      <w:r>
-        <w:rPr>
-          <w:b/>
-          <w:bCs/>
-        </w:rPr>
-        <w:t xml:space="preserve">Ludoteca</w:t>
-      </w:r>
-      <w:r>
-        <w:t xml:space="preserve"> </w:t>
-      </w:r>
-      <w:r>
-        <w:t xml:space="preserve">muestra, además de</w:t>
+        <w:t xml:space="preserve">Al entrar, tu nombre aparece a la derecha de la cabecera y despliega un</w:t>
+      </w:r>
+      <w:r>
+        <w:t xml:space="preserve"> </w:t>
+      </w:r>
+      <w:r>
+        <w:t xml:space="preserve">menú con</w:t>
       </w:r>
       <w:r>
         <w:t xml:space="preserve"> </w:t>
@@ -174,7 +170,29 @@
         <w:t xml:space="preserve">“Mis préstamos”</w:t>
       </w:r>
       <w:r>
-        <w:t xml:space="preserve">, un apartado</w:t>
+        <w:t xml:space="preserve"> </w:t>
+      </w:r>
+      <w:r>
+        <w:t xml:space="preserve">y</w:t>
+      </w:r>
+      <w:r>
+        <w:t xml:space="preserve"> </w:t>
+      </w:r>
+      <w:r>
+        <w:rPr>
+          <w:b/>
+          <w:bCs/>
+        </w:rPr>
+        <w:t xml:space="preserve">Cerrar sesión</w:t>
+      </w:r>
+      <w:r>
+        <w:t xml:space="preserve">. Si eres administrador, ese</w:t>
+      </w:r>
+      <w:r>
+        <w:t xml:space="preserve"> </w:t>
+      </w:r>
+      <w:r>
+        <w:t xml:space="preserve">mismo menú muestra además un apartado</w:t>
       </w:r>
       <w:r>
         <w:t xml:space="preserve"> </w:t>
@@ -190,7 +208,7 @@
         <w:t xml:space="preserve"> </w:t>
       </w:r>
       <w:r>
-        <w:t xml:space="preserve">con dos opciones:</w:t>
+        <w:t xml:space="preserve">con tres opciones:</w:t>
       </w:r>
     </w:p>
     <w:p>
@@ -237,7 +255,7 @@
           <w:b/>
           <w:bCs/>
         </w:rPr>
-        <w:t xml:space="preserve">Contenido</w:t>
+        <w:t xml:space="preserve">Contenido GSite</w:t>
       </w:r>
       <w:r>
         <w:t xml:space="preserve"> </w:t>
@@ -257,32 +275,47 @@
     </w:p>
     <w:p>
       <w:pPr>
+        <w:pStyle w:val="Compact"/>
+        <w:numPr>
+          <w:ilvl w:val="0"/>
+          <w:numId w:val="1001"/>
+        </w:numPr>
+      </w:pPr>
+      <w:r>
+        <w:rPr>
+          <w:b/>
+          <w:bCs/>
+        </w:rPr>
+        <w:t xml:space="preserve">Datos BGG</w:t>
+      </w:r>
+      <w:r>
+        <w:t xml:space="preserve"> </w:t>
+      </w:r>
+      <w:r>
+        <w:t xml:space="preserve">→ Reimportar el catálogo desde BoardGameGeek (</w:t>
+      </w:r>
+      <w:r>
+        <w:rPr>
+          <w:rStyle w:val="VerbatimChar"/>
+        </w:rPr>
+        <w:t xml:space="preserve">/ludoteca/admin/bgg</w:t>
+      </w:r>
+      <w:r>
+        <w:t xml:space="preserve">)</w:t>
+      </w:r>
+    </w:p>
+    <w:p>
+      <w:pPr>
         <w:pStyle w:val="FirstParagraph"/>
       </w:pPr>
       <w:r>
-        <w:t xml:space="preserve">Tu nombre y el botón</w:t>
-      </w:r>
-      <w:r>
-        <w:t xml:space="preserve"> </w:t>
-      </w:r>
-      <w:r>
-        <w:rPr>
-          <w:b/>
-          <w:bCs/>
-        </w:rPr>
-        <w:t xml:space="preserve">Cerrar sesión</w:t>
-      </w:r>
-      <w:r>
-        <w:t xml:space="preserve"> </w:t>
-      </w:r>
-      <w:r>
-        <w:t xml:space="preserve">aparecen en la cabecera. Si abres</w:t>
-      </w:r>
-      <w:r>
-        <w:t xml:space="preserve"> </w:t>
-      </w:r>
-      <w:r>
-        <w:t xml:space="preserve">una página de administración sin permisos verás</w:t>
+        <w:t xml:space="preserve">En el móvil, el mismo menú aparece bajo tu nombre al abrir el menú ☰. Si</w:t>
+      </w:r>
+      <w:r>
+        <w:t xml:space="preserve"> </w:t>
+      </w:r>
+      <w:r>
+        <w:t xml:space="preserve">abres una página de administración sin permisos verás</w:t>
       </w:r>
       <w:r>
         <w:t xml:space="preserve"> </w:t>
@@ -632,7 +665,7 @@
         <w:t xml:space="preserve"> </w:t>
       </w:r>
       <w:r>
-        <w:t xml:space="preserve">de socios (ver sección 5), así que conviene mantenerlos al día. El</w:t>
+        <w:t xml:space="preserve">de socios (ver sección 6), así que conviene mantenerlos al día. El</w:t>
       </w:r>
       <w:r>
         <w:t xml:space="preserve"> </w:t>
@@ -832,7 +865,7 @@
         <w:rPr>
           <w:rStyle w:val="VerbatimChar"/>
         </w:rPr>
-        <w:t xml:space="preserve">Nº Socio,Apellidos,Nombre,Apodo,Telefóno,Email,admin,Última cuota,Género</w:t>
+        <w:t xml:space="preserve">Nº Socio,Apellidos,Nombre,Apodo,Telefóno,Email,admin,Última cuota,Género,Pagada</w:t>
       </w:r>
     </w:p>
     <w:p>
@@ -997,7 +1030,103 @@
         <w:t xml:space="preserve"> </w:t>
       </w:r>
       <w:r>
-        <w:t xml:space="preserve">marca al socio como administrador.</w:t>
+        <w:t xml:space="preserve">marca al socio como administrador,</w:t>
+      </w:r>
+      <w:r>
+        <w:t xml:space="preserve"> </w:t>
+      </w:r>
+      <w:r>
+        <w:t xml:space="preserve">pero solo para socios nuevos: reimportar el CSV nunca retira el estado</w:t>
+      </w:r>
+      <w:r>
+        <w:t xml:space="preserve"> </w:t>
+      </w:r>
+      <w:r>
+        <w:t xml:space="preserve">de administrador a un socio existente (ni al tuyo propio, aunque tu fila</w:t>
+      </w:r>
+      <w:r>
+        <w:t xml:space="preserve"> </w:t>
+      </w:r>
+      <w:r>
+        <w:t xml:space="preserve">en la hoja no tenga la marca).</w:t>
+      </w:r>
+    </w:p>
+    <w:p>
+      <w:pPr>
+        <w:pStyle w:val="Compact"/>
+        <w:numPr>
+          <w:ilvl w:val="0"/>
+          <w:numId w:val="1003"/>
+        </w:numPr>
+      </w:pPr>
+      <w:r>
+        <w:t xml:space="preserve">La columna</w:t>
+      </w:r>
+      <w:r>
+        <w:t xml:space="preserve"> </w:t>
+      </w:r>
+      <w:r>
+        <w:rPr>
+          <w:rStyle w:val="VerbatimChar"/>
+        </w:rPr>
+        <w:t xml:space="preserve">Pagada</w:t>
+      </w:r>
+      <w:r>
+        <w:t xml:space="preserve"> </w:t>
+      </w:r>
+      <w:r>
+        <w:t xml:space="preserve">con valor</w:t>
+      </w:r>
+      <w:r>
+        <w:t xml:space="preserve"> </w:t>
+      </w:r>
+      <w:r>
+        <w:rPr>
+          <w:rStyle w:val="VerbatimChar"/>
+        </w:rPr>
+        <w:t xml:space="preserve">No</w:t>
+      </w:r>
+      <w:r>
+        <w:t xml:space="preserve"> </w:t>
+      </w:r>
+      <w:r>
+        <w:t xml:space="preserve">marca al socio como inactivo (no ha</w:t>
+      </w:r>
+      <w:r>
+        <w:t xml:space="preserve"> </w:t>
+      </w:r>
+      <w:r>
+        <w:t xml:space="preserve">pagado la cuota). Cualquier otro valor (</w:t>
+      </w:r>
+      <w:r>
+        <w:rPr>
+          <w:rStyle w:val="VerbatimChar"/>
+        </w:rPr>
+        <w:t xml:space="preserve">Sí</w:t>
+      </w:r>
+      <w:r>
+        <w:t xml:space="preserve">,</w:t>
+      </w:r>
+      <w:r>
+        <w:t xml:space="preserve"> </w:t>
+      </w:r>
+      <w:r>
+        <w:rPr>
+          <w:rStyle w:val="VerbatimChar"/>
+        </w:rPr>
+        <w:t xml:space="preserve">Honorífic</w:t>
+      </w:r>
+      <w:r>
+        <w:t xml:space="preserve"> </w:t>
+      </w:r>
+      <w:r>
+        <w:t xml:space="preserve">o la columna</w:t>
+      </w:r>
+      <w:r>
+        <w:t xml:space="preserve"> </w:t>
+      </w:r>
+      <w:r>
+        <w:t xml:space="preserve">vacía) lo deja activo.</w:t>
       </w:r>
     </w:p>
     <w:p>
@@ -1278,13 +1407,13 @@
       </w:r>
     </w:p>
     <w:bookmarkEnd w:id="16"/>
-    <w:bookmarkStart w:id="17" w:name="X00098c870b9d5de820649ced924a76ac80a1a90"/>
+    <w:bookmarkStart w:id="17" w:name="X93cc8f0b6103b7895c5244ee360d799366df690"/>
     <w:p>
       <w:pPr>
         <w:pStyle w:val="Heading2"/>
       </w:pPr>
       <w:r>
-        <w:t xml:space="preserve">4. Resincronizar contenido (Administración → Contenido)</w:t>
+        <w:t xml:space="preserve">4. Resincronizar contenido (Administración → Contenido GSite)</w:t>
       </w:r>
     </w:p>
     <w:p>
@@ -1472,13 +1601,13 @@
       </w:r>
     </w:p>
     <w:bookmarkEnd w:id="17"/>
-    <w:bookmarkStart w:id="18" w:name="validación-de-socios-página-pública"/>
+    <w:bookmarkStart w:id="18" w:name="datos-bgg-administración-datos-bgg"/>
     <w:p>
       <w:pPr>
         <w:pStyle w:val="Heading2"/>
       </w:pPr>
       <w:r>
-        <w:t xml:space="preserve">5. Validación de socios (página pública)</w:t>
+        <w:t xml:space="preserve">5. Datos BGG (Administración → Datos BGG)</w:t>
       </w:r>
     </w:p>
     <w:p>
@@ -1486,7 +1615,26 @@
         <w:pStyle w:val="FirstParagraph"/>
       </w:pPr>
       <w:r>
-        <w:t xml:space="preserve">En</w:t>
+        <w:t xml:space="preserve">El catálogo de juegos de mesa se gestiona en</w:t>
+      </w:r>
+      <w:r>
+        <w:t xml:space="preserve"> </w:t>
+      </w:r>
+      <w:r>
+        <w:rPr>
+          <w:b/>
+          <w:bCs/>
+        </w:rPr>
+        <w:t xml:space="preserve">BoardGameGeek (BGG)</w:t>
+      </w:r>
+      <w:r>
+        <w:t xml:space="preserve">, en la</w:t>
+      </w:r>
+      <w:r>
+        <w:t xml:space="preserve"> </w:t>
+      </w:r>
+      <w:r>
+        <w:t xml:space="preserve">colección de la cuenta</w:t>
       </w:r>
       <w:r>
         <w:t xml:space="preserve"> </w:t>
@@ -1495,151 +1643,16 @@
         <w:rPr>
           <w:rStyle w:val="VerbatimChar"/>
         </w:rPr>
-        <w:t xml:space="preserve">/ludoteca/validacion</w:t>
-      </w:r>
-      <w:r>
-        <w:t xml:space="preserve"> </w:t>
-      </w:r>
-      <w:r>
-        <w:t xml:space="preserve">(también accesible desde los códigos QR</w:t>
-      </w:r>
-      <w:r>
-        <w:t xml:space="preserve"> </w:t>
-      </w:r>
-      <w:r>
-        <w:t xml:space="preserve">impresos) cualquiera puede introducir un número de socio y ver si esa</w:t>
-      </w:r>
-      <w:r>
-        <w:t xml:space="preserve"> </w:t>
-      </w:r>
-      <w:r>
-        <w:t xml:space="preserve">persona</w:t>
-      </w:r>
-      <w:r>
-        <w:t xml:space="preserve"> </w:t>
-      </w:r>
-      <w:r>
-        <w:rPr>
-          <w:b/>
-          <w:bCs/>
-        </w:rPr>
-        <w:t xml:space="preserve">ES</w:t>
-      </w:r>
-      <w:r>
-        <w:t xml:space="preserve"> </w:t>
-      </w:r>
-      <w:r>
-        <w:t xml:space="preserve">o</w:t>
-      </w:r>
-      <w:r>
-        <w:t xml:space="preserve"> </w:t>
-      </w:r>
-      <w:r>
-        <w:rPr>
-          <w:b/>
-          <w:bCs/>
-        </w:rPr>
-        <w:t xml:space="preserve">NO ES</w:t>
-      </w:r>
-      <w:r>
-        <w:t xml:space="preserve"> </w:t>
-      </w:r>
-      <w:r>
-        <w:t xml:space="preserve">socio·a, junto con la fecha de su última cuota.</w:t>
-      </w:r>
-    </w:p>
-    <w:p>
-      <w:pPr>
-        <w:pStyle w:val="BodyText"/>
-      </w:pPr>
-      <w:r>
-        <w:t xml:space="preserve">No es una página de administración, pero se alimenta de los datos que tú</w:t>
-      </w:r>
-      <w:r>
-        <w:t xml:space="preserve"> </w:t>
-      </w:r>
-      <w:r>
-        <w:t xml:space="preserve">mantienes: el</w:t>
-      </w:r>
-      <w:r>
-        <w:t xml:space="preserve"> </w:t>
-      </w:r>
-      <w:r>
-        <w:rPr>
-          <w:b/>
-          <w:bCs/>
-        </w:rPr>
-        <w:t xml:space="preserve">Nº Socio</w:t>
-      </w:r>
-      <w:r>
-        <w:t xml:space="preserve">, la</w:t>
-      </w:r>
-      <w:r>
-        <w:t xml:space="preserve"> </w:t>
-      </w:r>
-      <w:r>
-        <w:rPr>
-          <w:b/>
-          <w:bCs/>
-        </w:rPr>
-        <w:t xml:space="preserve">Última cuota</w:t>
-      </w:r>
-      <w:r>
-        <w:t xml:space="preserve"> </w:t>
-      </w:r>
-      <w:r>
-        <w:t xml:space="preserve">y el</w:t>
-      </w:r>
-      <w:r>
-        <w:t xml:space="preserve"> </w:t>
-      </w:r>
-      <w:r>
-        <w:rPr>
-          <w:b/>
-          <w:bCs/>
-        </w:rPr>
-        <w:t xml:space="preserve">Género</w:t>
-      </w:r>
-      <w:r>
-        <w:t xml:space="preserve"> </w:t>
-      </w:r>
-      <w:r>
-        <w:t xml:space="preserve">de la</w:t>
-      </w:r>
-      <w:r>
-        <w:t xml:space="preserve"> </w:t>
-      </w:r>
-      <w:r>
-        <w:t xml:space="preserve">ficha de cada socio. Si la validación muestra datos desfasados, actualiza</w:t>
-      </w:r>
-      <w:r>
-        <w:t xml:space="preserve"> </w:t>
-      </w:r>
-      <w:r>
-        <w:t xml:space="preserve">la ficha desde Gestión de socios (botón</w:t>
-      </w:r>
-      <w:r>
-        <w:t xml:space="preserve"> </w:t>
-      </w:r>
-      <w:r>
-        <w:rPr>
-          <w:b/>
-          <w:bCs/>
-        </w:rPr>
-        <w:t xml:space="preserve">Editar</w:t>
-      </w:r>
-      <w:r>
-        <w:t xml:space="preserve">) o reimporta el CSV.</w:t>
-      </w:r>
-    </w:p>
-    <w:bookmarkEnd w:id="18"/>
-    <w:bookmarkStart w:id="19" w:name="qué-no-se-puede-hacer-desde-la-web"/>
-    <w:p>
-      <w:pPr>
-        <w:pStyle w:val="Heading2"/>
-      </w:pPr>
-      <w:r>
-        <w:t xml:space="preserve">6. Qué NO se puede hacer desde la web</w:t>
+        <w:t xml:space="preserve">RefugioDelSatiro</w:t>
+      </w:r>
+      <w:r>
+        <w:t xml:space="preserve">. Esta página permite traer los</w:t>
+      </w:r>
+      <w:r>
+        <w:t xml:space="preserve"> </w:t>
+      </w:r>
+      <w:r>
+        <w:t xml:space="preserve">cambios de esa colección a la web sin tocar el servidor:</w:t>
       </w:r>
     </w:p>
     <w:p>
@@ -1651,35 +1664,20 @@
         </w:numPr>
       </w:pPr>
       <w:r>
-        <w:rPr>
-          <w:b/>
-          <w:bCs/>
-        </w:rPr>
-        <w:t xml:space="preserve">Editar el catálogo de juegos.</w:t>
-      </w:r>
-      <w:r>
-        <w:t xml:space="preserve"> </w:t>
-      </w:r>
-      <w:r>
-        <w:t xml:space="preserve">Los juegos de mesa y de rol se cargan</w:t>
-      </w:r>
-      <w:r>
-        <w:t xml:space="preserve"> </w:t>
-      </w:r>
-      <w:r>
-        <w:t xml:space="preserve">por línea de comandos a partir de la colección de BoardGameGeek; no hay</w:t>
-      </w:r>
-      <w:r>
-        <w:t xml:space="preserve"> </w:t>
-      </w:r>
-      <w:r>
-        <w:t xml:space="preserve">pantalla para añadir, editar o borrar juegos. Pide los cambios a la</w:t>
-      </w:r>
-      <w:r>
-        <w:t xml:space="preserve"> </w:t>
-      </w:r>
-      <w:r>
-        <w:t xml:space="preserve">persona que mantiene el código.</w:t>
+        <w:t xml:space="preserve">El bloque de estado muestra la fecha de la</w:t>
+      </w:r>
+      <w:r>
+        <w:t xml:space="preserve"> </w:t>
+      </w:r>
+      <w:r>
+        <w:rPr>
+          <w:b/>
+          <w:bCs/>
+        </w:rPr>
+        <w:t xml:space="preserve">última importación</w:t>
+      </w:r>
+      <w:r>
+        <w:t xml:space="preserve">.</w:t>
       </w:r>
     </w:p>
     <w:p>
@@ -1691,99 +1689,303 @@
         </w:numPr>
       </w:pPr>
       <w:r>
-        <w:rPr>
-          <w:b/>
-          <w:bCs/>
-        </w:rPr>
-        <w:t xml:space="preserve">Cambiar nombre, email o teléfono de un socio</w:t>
-      </w:r>
-      <w:r>
-        <w:t xml:space="preserve"> </w:t>
-      </w:r>
-      <w:r>
-        <w:t xml:space="preserve">desde el botón Editar</w:t>
-      </w:r>
-      <w:r>
-        <w:t xml:space="preserve"> </w:t>
-      </w:r>
-      <w:r>
-        <w:t xml:space="preserve">(solo cambia Última cuota y Género). Para el resto de datos, corrige la</w:t>
-      </w:r>
-      <w:r>
-        <w:t xml:space="preserve"> </w:t>
-      </w:r>
-      <w:r>
-        <w:t xml:space="preserve">hoja de cálculo de socios y reimporta el CSV.</w:t>
-      </w:r>
-    </w:p>
-    <w:p>
-      <w:pPr>
-        <w:pStyle w:val="Compact"/>
-        <w:numPr>
-          <w:ilvl w:val="0"/>
-          <w:numId w:val="1007"/>
-        </w:numPr>
-      </w:pPr>
-      <w:r>
-        <w:rPr>
-          <w:b/>
-          <w:bCs/>
-        </w:rPr>
-        <w:t xml:space="preserve">Nombrar administradores</w:t>
-      </w:r>
-      <w:r>
-        <w:t xml:space="preserve"> </w:t>
-      </w:r>
-      <w:r>
-        <w:t xml:space="preserve">desde la web (ver sección 1).</w:t>
-      </w:r>
-    </w:p>
-    <w:p>
-      <w:pPr>
-        <w:pStyle w:val="Compact"/>
-        <w:numPr>
-          <w:ilvl w:val="0"/>
-          <w:numId w:val="1007"/>
-        </w:numPr>
-      </w:pPr>
-      <w:r>
-        <w:rPr>
-          <w:b/>
-          <w:bCs/>
-        </w:rPr>
-        <w:t xml:space="preserve">Borrar socios.</w:t>
-      </w:r>
-      <w:r>
-        <w:t xml:space="preserve"> </w:t>
-      </w:r>
-      <w:r>
-        <w:t xml:space="preserve">Usa</w:t>
-      </w:r>
-      <w:r>
-        <w:t xml:space="preserve"> </w:t>
-      </w:r>
-      <w:r>
-        <w:rPr>
-          <w:b/>
-          <w:bCs/>
-        </w:rPr>
-        <w:t xml:space="preserve">Desactivar</w:t>
-      </w:r>
-      <w:r>
-        <w:t xml:space="preserve"> </w:t>
-      </w:r>
-      <w:r>
-        <w:t xml:space="preserve">para retirar el acceso.</w:t>
+        <w:t xml:space="preserve">Pulsa</w:t>
+      </w:r>
+      <w:r>
+        <w:t xml:space="preserve"> </w:t>
+      </w:r>
+      <w:r>
+        <w:rPr>
+          <w:b/>
+          <w:bCs/>
+        </w:rPr>
+        <w:t xml:space="preserve">Reimportar desde BGG</w:t>
+      </w:r>
+      <w:r>
+        <w:t xml:space="preserve"> </w:t>
+      </w:r>
+      <w:r>
+        <w:t xml:space="preserve">después de añadir o quitar juegos en la</w:t>
+      </w:r>
+      <w:r>
+        <w:t xml:space="preserve"> </w:t>
+      </w:r>
+      <w:r>
+        <w:t xml:space="preserve">colección de BGG. Al terminar verás cuántos juegos son nuevos, cuántos</w:t>
+      </w:r>
+      <w:r>
+        <w:t xml:space="preserve"> </w:t>
+      </w:r>
+      <w:r>
+        <w:t xml:space="preserve">se han actualizado y el total importado.</w:t>
+      </w:r>
+    </w:p>
+    <w:p>
+      <w:pPr>
+        <w:pStyle w:val="FirstParagraph"/>
+      </w:pPr>
+      <w:r>
+        <w:rPr>
+          <w:b/>
+          <w:bCs/>
+        </w:rPr>
+        <w:t xml:space="preserve">Importante:</w:t>
+      </w:r>
+      <w:r>
+        <w:t xml:space="preserve"> </w:t>
+      </w:r>
+      <w:r>
+        <w:t xml:space="preserve">esto solo trae</w:t>
+      </w:r>
+      <w:r>
+        <w:t xml:space="preserve"> </w:t>
+      </w:r>
+      <w:r>
+        <w:rPr>
+          <w:b/>
+          <w:bCs/>
+        </w:rPr>
+        <w:t xml:space="preserve">juegos nuevos</w:t>
+      </w:r>
+      <w:r>
+        <w:t xml:space="preserve"> </w:t>
+      </w:r>
+      <w:r>
+        <w:t xml:space="preserve">y actualiza</w:t>
+      </w:r>
+      <w:r>
+        <w:t xml:space="preserve"> </w:t>
+      </w:r>
+      <w:r>
+        <w:rPr>
+          <w:b/>
+          <w:bCs/>
+        </w:rPr>
+        <w:t xml:space="preserve">nombre,</w:t>
+      </w:r>
+      <w:r>
+        <w:rPr>
+          <w:b/>
+          <w:bCs/>
+        </w:rPr>
+        <w:t xml:space="preserve"> </w:t>
+      </w:r>
+      <w:r>
+        <w:rPr>
+          <w:b/>
+          <w:bCs/>
+        </w:rPr>
+        <w:t xml:space="preserve">imagen y año de publicación</w:t>
+      </w:r>
+      <w:r>
+        <w:t xml:space="preserve"> </w:t>
+      </w:r>
+      <w:r>
+        <w:t xml:space="preserve">de los existentes. No borra juegos que hayan</w:t>
+      </w:r>
+      <w:r>
+        <w:t xml:space="preserve"> </w:t>
+      </w:r>
+      <w:r>
+        <w:t xml:space="preserve">desaparecido de BGG, no toca los juegos de rol y no actualiza puntuación,</w:t>
+      </w:r>
+      <w:r>
+        <w:t xml:space="preserve"> </w:t>
+      </w:r>
+      <w:r>
+        <w:t xml:space="preserve">número de jugadores ni duración de partida (eso requiere el comando</w:t>
+      </w:r>
+      <w:r>
+        <w:t xml:space="preserve"> </w:t>
+      </w:r>
+      <w:r>
+        <w:rPr>
+          <w:rStyle w:val="VerbatimChar"/>
+        </w:rPr>
+        <w:t xml:space="preserve">refugio enrich-games</w:t>
+      </w:r>
+      <w:r>
+        <w:t xml:space="preserve"> </w:t>
+      </w:r>
+      <w:r>
+        <w:t xml:space="preserve">desde el servidor). Pide esos cambios a la persona</w:t>
+      </w:r>
+      <w:r>
+        <w:t xml:space="preserve"> </w:t>
+      </w:r>
+      <w:r>
+        <w:t xml:space="preserve">que mantiene el código.</w:t>
+      </w:r>
+    </w:p>
+    <w:bookmarkEnd w:id="18"/>
+    <w:bookmarkStart w:id="19" w:name="validación-de-socios-página-pública"/>
+    <w:p>
+      <w:pPr>
+        <w:pStyle w:val="Heading2"/>
+      </w:pPr>
+      <w:r>
+        <w:t xml:space="preserve">6. Validación de socios (página pública)</w:t>
+      </w:r>
+    </w:p>
+    <w:p>
+      <w:pPr>
+        <w:pStyle w:val="FirstParagraph"/>
+      </w:pPr>
+      <w:r>
+        <w:t xml:space="preserve">En</w:t>
+      </w:r>
+      <w:r>
+        <w:t xml:space="preserve"> </w:t>
+      </w:r>
+      <w:r>
+        <w:rPr>
+          <w:rStyle w:val="VerbatimChar"/>
+        </w:rPr>
+        <w:t xml:space="preserve">/ludoteca/validacion</w:t>
+      </w:r>
+      <w:r>
+        <w:t xml:space="preserve"> </w:t>
+      </w:r>
+      <w:r>
+        <w:t xml:space="preserve">(también accesible desde los códigos QR</w:t>
+      </w:r>
+      <w:r>
+        <w:t xml:space="preserve"> </w:t>
+      </w:r>
+      <w:r>
+        <w:t xml:space="preserve">impresos) cualquiera puede introducir un número de socio y ver si esa</w:t>
+      </w:r>
+      <w:r>
+        <w:t xml:space="preserve"> </w:t>
+      </w:r>
+      <w:r>
+        <w:t xml:space="preserve">persona</w:t>
+      </w:r>
+      <w:r>
+        <w:t xml:space="preserve"> </w:t>
+      </w:r>
+      <w:r>
+        <w:rPr>
+          <w:b/>
+          <w:bCs/>
+        </w:rPr>
+        <w:t xml:space="preserve">ES</w:t>
+      </w:r>
+      <w:r>
+        <w:t xml:space="preserve"> </w:t>
+      </w:r>
+      <w:r>
+        <w:t xml:space="preserve">o</w:t>
+      </w:r>
+      <w:r>
+        <w:t xml:space="preserve"> </w:t>
+      </w:r>
+      <w:r>
+        <w:rPr>
+          <w:b/>
+          <w:bCs/>
+        </w:rPr>
+        <w:t xml:space="preserve">NO ES</w:t>
+      </w:r>
+      <w:r>
+        <w:t xml:space="preserve"> </w:t>
+      </w:r>
+      <w:r>
+        <w:t xml:space="preserve">socio·a, junto con la fecha de su última cuota.</w:t>
+      </w:r>
+    </w:p>
+    <w:p>
+      <w:pPr>
+        <w:pStyle w:val="BodyText"/>
+      </w:pPr>
+      <w:r>
+        <w:t xml:space="preserve">No es una página de administración, pero se alimenta de los datos que tú</w:t>
+      </w:r>
+      <w:r>
+        <w:t xml:space="preserve"> </w:t>
+      </w:r>
+      <w:r>
+        <w:t xml:space="preserve">mantienes: el</w:t>
+      </w:r>
+      <w:r>
+        <w:t xml:space="preserve"> </w:t>
+      </w:r>
+      <w:r>
+        <w:rPr>
+          <w:b/>
+          <w:bCs/>
+        </w:rPr>
+        <w:t xml:space="preserve">Nº Socio</w:t>
+      </w:r>
+      <w:r>
+        <w:t xml:space="preserve">, la</w:t>
+      </w:r>
+      <w:r>
+        <w:t xml:space="preserve"> </w:t>
+      </w:r>
+      <w:r>
+        <w:rPr>
+          <w:b/>
+          <w:bCs/>
+        </w:rPr>
+        <w:t xml:space="preserve">Última cuota</w:t>
+      </w:r>
+      <w:r>
+        <w:t xml:space="preserve"> </w:t>
+      </w:r>
+      <w:r>
+        <w:t xml:space="preserve">y el</w:t>
+      </w:r>
+      <w:r>
+        <w:t xml:space="preserve"> </w:t>
+      </w:r>
+      <w:r>
+        <w:rPr>
+          <w:b/>
+          <w:bCs/>
+        </w:rPr>
+        <w:t xml:space="preserve">Género</w:t>
+      </w:r>
+      <w:r>
+        <w:t xml:space="preserve"> </w:t>
+      </w:r>
+      <w:r>
+        <w:t xml:space="preserve">de la</w:t>
+      </w:r>
+      <w:r>
+        <w:t xml:space="preserve"> </w:t>
+      </w:r>
+      <w:r>
+        <w:t xml:space="preserve">ficha de cada socio. Si la validación muestra datos desfasados, actualiza</w:t>
+      </w:r>
+      <w:r>
+        <w:t xml:space="preserve"> </w:t>
+      </w:r>
+      <w:r>
+        <w:t xml:space="preserve">la ficha desde Gestión de socios (botón</w:t>
+      </w:r>
+      <w:r>
+        <w:t xml:space="preserve"> </w:t>
+      </w:r>
+      <w:r>
+        <w:rPr>
+          <w:b/>
+          <w:bCs/>
+        </w:rPr>
+        <w:t xml:space="preserve">Editar</w:t>
+      </w:r>
+      <w:r>
+        <w:t xml:space="preserve">) o reimporta el CSV.</w:t>
       </w:r>
     </w:p>
     <w:bookmarkEnd w:id="19"/>
-    <w:bookmarkStart w:id="20" w:name="problemas-frecuentes"/>
+    <w:bookmarkStart w:id="20" w:name="qué-no-se-puede-hacer-desde-la-web"/>
     <w:p>
       <w:pPr>
         <w:pStyle w:val="Heading2"/>
       </w:pPr>
       <w:r>
-        <w:t xml:space="preserve">7. Problemas frecuentes</w:t>
+        <w:t xml:space="preserve">7. Qué NO se puede hacer desde la web</w:t>
       </w:r>
     </w:p>
     <w:p>
@@ -1799,53 +2001,37 @@
           <w:b/>
           <w:bCs/>
         </w:rPr>
-        <w:t xml:space="preserve">Un socio no puede entrar</w:t>
-      </w:r>
-      <w:r>
-        <w:t xml:space="preserve"> </w:t>
-      </w:r>
-      <w:r>
-        <w:t xml:space="preserve">→ usa</w:t>
-      </w:r>
-      <w:r>
-        <w:t xml:space="preserve"> </w:t>
-      </w:r>
-      <w:r>
-        <w:rPr>
-          <w:b/>
-          <w:bCs/>
-        </w:rPr>
-        <w:t xml:space="preserve">Enviar enlace de acceso</w:t>
-      </w:r>
-      <w:r>
-        <w:t xml:space="preserve"> </w:t>
-      </w:r>
-      <w:r>
-        <w:t xml:space="preserve">para que</w:t>
-      </w:r>
-      <w:r>
-        <w:t xml:space="preserve"> </w:t>
-      </w:r>
-      <w:r>
-        <w:t xml:space="preserve">restablezca su contraseña. También existe la página</w:t>
-      </w:r>
-      <w:r>
-        <w:t xml:space="preserve"> </w:t>
-      </w:r>
-      <w:r>
-        <w:t xml:space="preserve">“¿Has olvidado tu</w:t>
-      </w:r>
-      <w:r>
-        <w:t xml:space="preserve"> </w:t>
-      </w:r>
-      <w:r>
-        <w:t xml:space="preserve">contraseña?”</w:t>
-      </w:r>
-      <w:r>
-        <w:t xml:space="preserve"> </w:t>
-      </w:r>
-      <w:r>
-        <w:t xml:space="preserve">en la pantalla de inicio de sesión.</w:t>
+        <w:t xml:space="preserve">Editar el catálogo de juegos a mano.</w:t>
+      </w:r>
+      <w:r>
+        <w:t xml:space="preserve"> </w:t>
+      </w:r>
+      <w:r>
+        <w:t xml:space="preserve">Desde Datos BGG puedes</w:t>
+      </w:r>
+      <w:r>
+        <w:t xml:space="preserve"> </w:t>
+      </w:r>
+      <w:r>
+        <w:t xml:space="preserve">reimportar la colección de BGG, pero no hay pantalla para añadir, editar</w:t>
+      </w:r>
+      <w:r>
+        <w:t xml:space="preserve"> </w:t>
+      </w:r>
+      <w:r>
+        <w:t xml:space="preserve">o borrar un juego suelto, ni para gestionar los juegos de rol o traer</w:t>
+      </w:r>
+      <w:r>
+        <w:t xml:space="preserve"> </w:t>
+      </w:r>
+      <w:r>
+        <w:t xml:space="preserve">puntuación/jugadores/duración. Pide esos cambios a la persona que</w:t>
+      </w:r>
+      <w:r>
+        <w:t xml:space="preserve"> </w:t>
+      </w:r>
+      <w:r>
+        <w:t xml:space="preserve">mantiene el código.</w:t>
       </w:r>
     </w:p>
     <w:p>
@@ -1861,46 +2047,25 @@
           <w:b/>
           <w:bCs/>
         </w:rPr>
-        <w:t xml:space="preserve">El enlace de acceso</w:t>
-      </w:r>
-      <w:r>
-        <w:rPr>
-          <w:b/>
-          <w:bCs/>
-        </w:rPr>
-        <w:t xml:space="preserve"> </w:t>
-      </w:r>
-      <w:r>
-        <w:rPr>
-          <w:b/>
-          <w:bCs/>
-        </w:rPr>
-        <w:t xml:space="preserve">“no funciona”</w:t>
-      </w:r>
-      <w:r>
-        <w:t xml:space="preserve"> </w:t>
-      </w:r>
-      <w:r>
-        <w:t xml:space="preserve">→ probablemente caducó (48 h) o</w:t>
-      </w:r>
-      <w:r>
-        <w:t xml:space="preserve"> </w:t>
-      </w:r>
-      <w:r>
-        <w:t xml:space="preserve">ya se usó. Genera uno nuevo con</w:t>
-      </w:r>
-      <w:r>
-        <w:t xml:space="preserve"> </w:t>
-      </w:r>
-      <w:r>
-        <w:rPr>
-          <w:b/>
-          <w:bCs/>
-        </w:rPr>
-        <w:t xml:space="preserve">Enviar enlace de acceso</w:t>
-      </w:r>
-      <w:r>
-        <w:t xml:space="preserve">.</w:t>
+        <w:t xml:space="preserve">Cambiar nombre, email o teléfono de un socio</w:t>
+      </w:r>
+      <w:r>
+        <w:t xml:space="preserve"> </w:t>
+      </w:r>
+      <w:r>
+        <w:t xml:space="preserve">desde el botón Editar</w:t>
+      </w:r>
+      <w:r>
+        <w:t xml:space="preserve"> </w:t>
+      </w:r>
+      <w:r>
+        <w:t xml:space="preserve">(solo cambia Última cuota y Género). Para el resto de datos, corrige la</w:t>
+      </w:r>
+      <w:r>
+        <w:t xml:space="preserve"> </w:t>
+      </w:r>
+      <w:r>
+        <w:t xml:space="preserve">hoja de cálculo de socios y reimporta el CSV.</w:t>
       </w:r>
     </w:p>
     <w:p>
@@ -1916,33 +2081,13 @@
           <w:b/>
           <w:bCs/>
         </w:rPr>
-        <w:t xml:space="preserve">La importación dice</w:t>
-      </w:r>
-      <w:r>
-        <w:rPr>
-          <w:b/>
-          <w:bCs/>
-        </w:rPr>
-        <w:t xml:space="preserve"> </w:t>
-      </w:r>
-      <w:r>
-        <w:rPr>
-          <w:b/>
-          <w:bCs/>
-        </w:rPr>
-        <w:t xml:space="preserve">“filas omitidas”</w:t>
-      </w:r>
-      <w:r>
-        <w:t xml:space="preserve"> </w:t>
-      </w:r>
-      <w:r>
-        <w:t xml:space="preserve">→ esas filas no tenían email.</w:t>
-      </w:r>
-      <w:r>
-        <w:t xml:space="preserve"> </w:t>
-      </w:r>
-      <w:r>
-        <w:t xml:space="preserve">Complétalo en la hoja de cálculo y reimporta.</w:t>
+        <w:t xml:space="preserve">Nombrar administradores</w:t>
+      </w:r>
+      <w:r>
+        <w:t xml:space="preserve"> </w:t>
+      </w:r>
+      <w:r>
+        <w:t xml:space="preserve">desde la web (ver sección 1).</w:t>
       </w:r>
     </w:p>
     <w:p>
@@ -1958,6 +2103,259 @@
           <w:b/>
           <w:bCs/>
         </w:rPr>
+        <w:t xml:space="preserve">Borrar socios.</w:t>
+      </w:r>
+      <w:r>
+        <w:t xml:space="preserve"> </w:t>
+      </w:r>
+      <w:r>
+        <w:t xml:space="preserve">Usa</w:t>
+      </w:r>
+      <w:r>
+        <w:t xml:space="preserve"> </w:t>
+      </w:r>
+      <w:r>
+        <w:rPr>
+          <w:b/>
+          <w:bCs/>
+        </w:rPr>
+        <w:t xml:space="preserve">Desactivar</w:t>
+      </w:r>
+      <w:r>
+        <w:t xml:space="preserve"> </w:t>
+      </w:r>
+      <w:r>
+        <w:t xml:space="preserve">para retirar el acceso.</w:t>
+      </w:r>
+    </w:p>
+    <w:bookmarkEnd w:id="20"/>
+    <w:bookmarkStart w:id="21" w:name="problemas-frecuentes"/>
+    <w:p>
+      <w:pPr>
+        <w:pStyle w:val="Heading2"/>
+      </w:pPr>
+      <w:r>
+        <w:t xml:space="preserve">8. Problemas frecuentes</w:t>
+      </w:r>
+    </w:p>
+    <w:p>
+      <w:pPr>
+        <w:pStyle w:val="Compact"/>
+        <w:numPr>
+          <w:ilvl w:val="0"/>
+          <w:numId w:val="1009"/>
+        </w:numPr>
+      </w:pPr>
+      <w:r>
+        <w:rPr>
+          <w:b/>
+          <w:bCs/>
+        </w:rPr>
+        <w:t xml:space="preserve">Un socio no puede entrar</w:t>
+      </w:r>
+      <w:r>
+        <w:t xml:space="preserve"> </w:t>
+      </w:r>
+      <w:r>
+        <w:t xml:space="preserve">→ usa</w:t>
+      </w:r>
+      <w:r>
+        <w:t xml:space="preserve"> </w:t>
+      </w:r>
+      <w:r>
+        <w:rPr>
+          <w:b/>
+          <w:bCs/>
+        </w:rPr>
+        <w:t xml:space="preserve">Enviar enlace de acceso</w:t>
+      </w:r>
+      <w:r>
+        <w:t xml:space="preserve"> </w:t>
+      </w:r>
+      <w:r>
+        <w:t xml:space="preserve">para que</w:t>
+      </w:r>
+      <w:r>
+        <w:t xml:space="preserve"> </w:t>
+      </w:r>
+      <w:r>
+        <w:t xml:space="preserve">restablezca su contraseña. También existe la página</w:t>
+      </w:r>
+      <w:r>
+        <w:t xml:space="preserve"> </w:t>
+      </w:r>
+      <w:r>
+        <w:t xml:space="preserve">“¿Has olvidado tu</w:t>
+      </w:r>
+      <w:r>
+        <w:t xml:space="preserve"> </w:t>
+      </w:r>
+      <w:r>
+        <w:t xml:space="preserve">contraseña?”</w:t>
+      </w:r>
+      <w:r>
+        <w:t xml:space="preserve"> </w:t>
+      </w:r>
+      <w:r>
+        <w:t xml:space="preserve">en la pantalla de inicio de sesión.</w:t>
+      </w:r>
+    </w:p>
+    <w:p>
+      <w:pPr>
+        <w:pStyle w:val="Compact"/>
+        <w:numPr>
+          <w:ilvl w:val="0"/>
+          <w:numId w:val="1009"/>
+        </w:numPr>
+      </w:pPr>
+      <w:r>
+        <w:rPr>
+          <w:b/>
+          <w:bCs/>
+        </w:rPr>
+        <w:t xml:space="preserve">El enlace de acceso</w:t>
+      </w:r>
+      <w:r>
+        <w:rPr>
+          <w:b/>
+          <w:bCs/>
+        </w:rPr>
+        <w:t xml:space="preserve"> </w:t>
+      </w:r>
+      <w:r>
+        <w:rPr>
+          <w:b/>
+          <w:bCs/>
+        </w:rPr>
+        <w:t xml:space="preserve">“no funciona”</w:t>
+      </w:r>
+      <w:r>
+        <w:t xml:space="preserve"> </w:t>
+      </w:r>
+      <w:r>
+        <w:t xml:space="preserve">→ probablemente caducó (48 h) o</w:t>
+      </w:r>
+      <w:r>
+        <w:t xml:space="preserve"> </w:t>
+      </w:r>
+      <w:r>
+        <w:t xml:space="preserve">ya se usó. Genera uno nuevo con</w:t>
+      </w:r>
+      <w:r>
+        <w:t xml:space="preserve"> </w:t>
+      </w:r>
+      <w:r>
+        <w:rPr>
+          <w:b/>
+          <w:bCs/>
+        </w:rPr>
+        <w:t xml:space="preserve">Enviar enlace de acceso</w:t>
+      </w:r>
+      <w:r>
+        <w:t xml:space="preserve">.</w:t>
+      </w:r>
+    </w:p>
+    <w:p>
+      <w:pPr>
+        <w:pStyle w:val="Compact"/>
+        <w:numPr>
+          <w:ilvl w:val="0"/>
+          <w:numId w:val="1009"/>
+        </w:numPr>
+      </w:pPr>
+      <w:r>
+        <w:rPr>
+          <w:b/>
+          <w:bCs/>
+        </w:rPr>
+        <w:t xml:space="preserve">La importación dice</w:t>
+      </w:r>
+      <w:r>
+        <w:rPr>
+          <w:b/>
+          <w:bCs/>
+        </w:rPr>
+        <w:t xml:space="preserve"> </w:t>
+      </w:r>
+      <w:r>
+        <w:rPr>
+          <w:b/>
+          <w:bCs/>
+        </w:rPr>
+        <w:t xml:space="preserve">“filas omitidas”</w:t>
+      </w:r>
+      <w:r>
+        <w:t xml:space="preserve"> </w:t>
+      </w:r>
+      <w:r>
+        <w:t xml:space="preserve">→ esas filas no tenían email.</w:t>
+      </w:r>
+      <w:r>
+        <w:t xml:space="preserve"> </w:t>
+      </w:r>
+      <w:r>
+        <w:t xml:space="preserve">Complétalo en la hoja de cálculo y reimporta.</w:t>
+      </w:r>
+    </w:p>
+    <w:p>
+      <w:pPr>
+        <w:pStyle w:val="Compact"/>
+        <w:numPr>
+          <w:ilvl w:val="0"/>
+          <w:numId w:val="1009"/>
+        </w:numPr>
+      </w:pPr>
+      <w:r>
+        <w:rPr>
+          <w:b/>
+          <w:bCs/>
+        </w:rPr>
+        <w:t xml:space="preserve">Falta un juego nuevo, o su nombre/imagen está desactualizado</w:t>
+      </w:r>
+      <w:r>
+        <w:t xml:space="preserve"> </w:t>
+      </w:r>
+      <w:r>
+        <w:t xml:space="preserve">→ lanza</w:t>
+      </w:r>
+      <w:r>
+        <w:t xml:space="preserve"> </w:t>
+      </w:r>
+      <w:r>
+        <w:t xml:space="preserve">una importación desde Administración → Datos BGG. Si el juego sigue sin</w:t>
+      </w:r>
+      <w:r>
+        <w:t xml:space="preserve"> </w:t>
+      </w:r>
+      <w:r>
+        <w:t xml:space="preserve">aparecer, comprueba que está marcado como</w:t>
+      </w:r>
+      <w:r>
+        <w:t xml:space="preserve"> </w:t>
+      </w:r>
+      <w:r>
+        <w:t xml:space="preserve">“own”</w:t>
+      </w:r>
+      <w:r>
+        <w:t xml:space="preserve"> </w:t>
+      </w:r>
+      <w:r>
+        <w:t xml:space="preserve">en la colección de BGG.</w:t>
+      </w:r>
+    </w:p>
+    <w:p>
+      <w:pPr>
+        <w:pStyle w:val="Compact"/>
+        <w:numPr>
+          <w:ilvl w:val="0"/>
+          <w:numId w:val="1009"/>
+        </w:numPr>
+      </w:pPr>
+      <w:r>
+        <w:rPr>
+          <w:b/>
+          <w:bCs/>
+        </w:rPr>
         <w:t xml:space="preserve">He editado Google Sites y la web no cambia</w:t>
       </w:r>
       <w:r>
@@ -1970,11 +2368,11 @@
         <w:t xml:space="preserve"> </w:t>
       </w:r>
       <w:r>
-        <w:t xml:space="preserve">Administración → Contenido, o espera a la sincronización nocturna.</w:t>
-      </w:r>
-    </w:p>
-    <w:bookmarkEnd w:id="20"/>
+        <w:t xml:space="preserve">Administración → Contenido GSite, o espera a la sincronización nocturna.</w:t>
+      </w:r>
+    </w:p>
     <w:bookmarkEnd w:id="21"/>
+    <w:bookmarkEnd w:id="22"/>
     <w:sectPr>
       <w:footnotePr>
         <w:numRestart w:val="eachSect"/>
@@ -2325,6 +2723,9 @@
     <w:abstractNumId w:val="991"/>
   </w:num>
   <w:num w:numId="1008">
+    <w:abstractNumId w:val="991"/>
+  </w:num>
+  <w:num w:numId="1009">
     <w:abstractNumId w:val="991"/>
   </w:num>
 </w:numbering>

</xml_diff>